<commit_message>
Add AHEAD and Radius cover letters; refresh Priority Commerce letter.
Include the hardware-store React/Python suite and Cursor AI work in the Priority and AHEAD letters, and add a Radius Global Solutions Senior Programmer/Analyst letter focused on C#/.NET and file interfaces.
</commit_message>
<xml_diff>
--- a/Cover_Letter_Priority_Commerce_Software_Engineer.docx
+++ b/Cover_Letter_Priority_Commerce_Software_Engineer.docx
@@ -21,7 +21,7 @@
         <w:pStyle w:val="BodyText"/>
       </w:pPr>
       <w:r>
-        <w:t xml:space="preserve">August 12, 2026</w:t>
+        <w:t xml:space="preserve">August 17, 2026</w:t>
       </w:r>
     </w:p>
     <w:p>
@@ -57,7 +57,7 @@
         <w:pStyle w:val="BodyText"/>
       </w:pPr>
       <w:r>
-        <w:t xml:space="preserve">I am writing to apply for the Software Engineer role at Priority Commerce. Your mission to streamline payables, acquiring, and treasury through a unified platform resonates with how I approach software: build secure, maintainable systems that improve operational flow and deliver measurable results. With well over three to five years of professional development experience—and more than a decade modernizing and supporting business-critical Microsoft applications—I am excited to contribute to Priority’s core fintech systems.</w:t>
+        <w:t xml:space="preserve">I am writing to apply for the Software Engineer role at Priority Commerce. Your focus on secure, maintainable fintech systems—and on responsible AI-assisted engineering—aligns closely with how I build software: ship reliable features, strengthen operational health, and own the quality of what I deliver.</w:t>
       </w:r>
     </w:p>
     <w:p>
@@ -65,7 +65,7 @@
         <w:pStyle w:val="BodyText"/>
       </w:pPr>
       <w:r>
-        <w:t xml:space="preserve">My core strengths map closely to your requirements. I develop in C# and JavaScript, build and maintain server-side .NET applications (including ASP.NET MVC and Web API), and work extensively with Microsoft SQL Server—writing and owning T-SQL procedures, functions, and jobs that underpin production workflows. At MedBen, I engineered a Flexible Spending Account system to replace a legacy platform, collaborated on inbound/outbound eligibility processing, and enhanced a client-facing web portal for analytics and reporting. At Heating And Cooling Products, I modernized desktop applications across business units, improved operational reporting, and supported production systems in a fast-moving environment. Earlier, at Tsunami Software, I helped convert a VB6 order entry application to ASP.NET MVC4—experience that reflects the same balance of feature delivery, quality, and maintainability you describe.</w:t>
+        <w:t xml:space="preserve">I bring well over three to five years of professional development experience across C#, JavaScript, .NET server-side applications, and Microsoft SQL Server. At MedBen, I engineered a Flexible Spending Account system to replace a legacy platform, collaborated on inbound/outbound eligibility processing, and enhanced a client-facing web portal for analytics and reporting. At Heating And Cooling Products, I modernized applications across business units, improved SQL Server–backed workflows and reporting, and supported production systems. At Tsunami Software, I helped convert a VB6 order entry application to ASP.NET MVC4. Across these roles I have worked in agile, cross-functional settings; diagnosed and fixed production issues within my ownership; and balanced feature delivery with maintainability, testing discipline, and incremental performance improvements.</w:t>
       </w:r>
     </w:p>
     <w:p>
@@ -73,7 +73,7 @@
         <w:pStyle w:val="BodyText"/>
       </w:pPr>
       <w:r>
-        <w:t xml:space="preserve">I am accustomed to working across product, operations, and technical stakeholders; participating in iterative delivery; and owning solutions through support and enhancement. Much of my career has been in regulated, transaction-oriented domains—especially healthcare claims and benefits processing—where accuracy, security awareness, and careful testing matter. I write and refine solutions with maintainability in mind, diagnose production issues within my ownership, and continuously improve reliability and performance through incremental change.</w:t>
+        <w:t xml:space="preserve">Most recently, I have been building a suite of tools for a hardware store that unifies product lookup, store inventory control, product grouping with tags, and physical retail barcode label creation in a single application. I developed that suite as a full-stack product with a React front end and a Python backend, using Cursor AI for pair programming, scaffolding, refactoring, test ideas, and documentation support—while applying sound design judgment and fully owning the code I ship. That project strengthens my modern web experience and demonstrates the responsible AI-assisted practices Priority expects.</w:t>
       </w:r>
     </w:p>
     <w:p>
@@ -81,7 +81,7 @@
         <w:pStyle w:val="BodyText"/>
       </w:pPr>
       <w:r>
-        <w:t xml:space="preserve">I also practice responsible AI-assisted engineering. In my recent freelance and day-to-day development work, I use tools such as Cursor AI for pair programming, code generation, refactoring, test ideas, and documentation support. I treat AI as a productivity and consistency accelerator while applying sound design judgment and fully owning the code I ship—aligning with Priority’s expectations for modern development practices.</w:t>
+        <w:t xml:space="preserve">Much of my career has been in regulated, transaction-oriented environments—especially healthcare financial and benefits processing—where accuracy, security awareness, and careful testing matter. I am motivated by platforms that accelerate cash flow and operational clarity, and I am eager to apply that mindset to Priority’s Commerce Engine across payables, acquiring, and treasury solutions.</w:t>
       </w:r>
     </w:p>
     <w:p>
@@ -89,7 +89,7 @@
         <w:pStyle w:val="BodyText"/>
       </w:pPr>
       <w:r>
-        <w:t xml:space="preserve">I would welcome the chance to help Priority Commerce deliver reliable, well-tested features that strengthen platform stability and accelerate client outcomes. Thank you for your time and consideration.</w:t>
+        <w:t xml:space="preserve">I would welcome the opportunity to contribute reliable, well-tested features, collaborate with product, architecture, UX, quality, and operations, and keep growing as an engineer on Priority’s core systems. Thank you for your time and consideration.</w:t>
       </w:r>
     </w:p>
     <w:p>

</xml_diff>